<commit_message>
Update portfolio & resume: add LMS 2.0, TRG Personnel, INC Directory, GLPI on Proxmox; update PMD Dashboard to React; add SFM School & AI tools experience
</commit_message>
<xml_diff>
--- a/PAREJA FELIX M - Updated 2026.docx
+++ b/PAREJA FELIX M - Updated 2026.docx
@@ -139,7 +139,7 @@
         <w:spacing w:after="100"/>
       </w:pPr>
       <w:r>
-        <w:t>Senior Full-Stack Developer and Software Engineer with 15+ years of experience designing, developing, integrating, deploying, and maintaining web-based business applications, inventory systems, personnel and document platforms, dashboards, kiosk applications, and computer-vision solutions. Experienced across the complete software development lifecycle, from requirements and database design through UI/backend implementation, authentication, deployment, troubleshooting, and long-term production support.</w:t>
+        <w:t>Senior Full-Stack Developer and Software Engineer with 15+ years of experience designing, developing, integrating, deploying, and maintaining web-based business applications, inventory systems, personnel and document platforms, dashboards, kiosk applications, and mobile applications, and interactive kiosks. Experienced across the complete software development lifecycle, from requirements and database design through UI/backend implementation, authentication, deployment, troubleshooting, and long-term production support.</w:t>
       </w:r>
     </w:p>
     <w:p>
@@ -162,16 +162,21 @@
     </w:p>
     <w:p>
       <w:pPr>
-        <w:spacing w:after="40"/>
+        <w:spacing w:after="40" w:before="20" w:line="276" w:lineRule="auto"/>
       </w:pPr>
+      <w:r/>
       <w:r>
         <w:rPr>
+          <w:rFonts w:ascii="Aptos" w:hAnsi="Aptos"/>
           <w:b/>
+          <w:sz w:val="18"/>
         </w:rPr>
         <w:t xml:space="preserve">Full-Stack Web: </w:t>
       </w:r>
       <w:r>
         <w:rPr>
+          <w:rFonts w:ascii="Aptos" w:hAnsi="Aptos"/>
+          <w:b w:val="0"/>
           <w:sz w:val="18"/>
         </w:rPr>
         <w:t>PHP 8, Laravel, JavaScript, React, Vite, Node.js, Express.js, Blade, Bootstrap, jQuery, AJAX, HTML5, CSS3</w:t>
@@ -179,16 +184,21 @@
     </w:p>
     <w:p>
       <w:pPr>
-        <w:spacing w:after="40"/>
+        <w:spacing w:after="40" w:before="20" w:line="276" w:lineRule="auto"/>
       </w:pPr>
+      <w:r/>
       <w:r>
         <w:rPr>
+          <w:rFonts w:ascii="Aptos" w:hAnsi="Aptos"/>
           <w:b/>
+          <w:sz w:val="18"/>
         </w:rPr>
         <w:t xml:space="preserve">Data, APIs &amp; Security: </w:t>
       </w:r>
       <w:r>
         <w:rPr>
+          <w:rFonts w:ascii="Aptos" w:hAnsi="Aptos"/>
+          <w:b w:val="0"/>
           <w:sz w:val="18"/>
         </w:rPr>
         <w:t>MySQL, MariaDB, PostgreSQL, SQL Server, REST APIs, JSON, Laravel Sanctum, RBAC, access matrices, sessions, audit logs</w:t>
@@ -196,36 +206,112 @@
     </w:p>
     <w:p>
       <w:pPr>
-        <w:spacing w:after="40"/>
+        <w:spacing w:after="40" w:before="20" w:line="276" w:lineRule="auto"/>
       </w:pPr>
+      <w:r/>
       <w:r>
         <w:rPr>
+          <w:rFonts w:ascii="Aptos" w:hAnsi="Aptos"/>
           <w:b/>
+          <w:sz w:val="18"/>
         </w:rPr>
-        <w:t xml:space="preserve">Infrastructure: </w:t>
+        <w:t xml:space="preserve">DevOps &amp; Containerization: </w:t>
       </w:r>
       <w:r>
         <w:rPr>
+          <w:rFonts w:ascii="Aptos" w:hAnsi="Aptos"/>
+          <w:b w:val="0"/>
           <w:sz w:val="18"/>
         </w:rPr>
-        <w:t>Linux, Ubuntu, Windows Server, Apache, Nginx, Proxmox, virtual machines, Samba/CIFS, XAMPP/LAMPP, DNS, Git, Composer, npm</w:t>
+        <w:t>Docker (Containerization of Apps), Docker Compose, GitHub, CI/CD Workflows, Git</w:t>
       </w:r>
     </w:p>
     <w:p>
       <w:pPr>
-        <w:spacing w:after="40"/>
+        <w:spacing w:after="40" w:before="20" w:line="276" w:lineRule="auto"/>
       </w:pPr>
+      <w:r/>
       <w:r>
         <w:rPr>
+          <w:rFonts w:ascii="Aptos" w:hAnsi="Aptos"/>
           <w:b/>
+          <w:sz w:val="18"/>
+        </w:rPr>
+        <w:t xml:space="preserve">Cloud &amp; Modern Platforms: </w:t>
+      </w:r>
+      <w:r>
+        <w:rPr>
+          <w:rFonts w:ascii="Aptos" w:hAnsi="Aptos"/>
+          <w:b w:val="0"/>
+          <w:sz w:val="18"/>
+        </w:rPr>
+        <w:t>Vercel (Serverless &amp; Edge Deployment), Firebase (Auth &amp; Firestore), Nextcloud APIs, REST Integrations</w:t>
+      </w:r>
+    </w:p>
+    <w:p>
+      <w:pPr>
+        <w:spacing w:before="20" w:after="40" w:line="276" w:lineRule="auto"/>
+      </w:pPr>
+      <w:r/>
+      <w:r>
+        <w:rPr>
+          <w:rFonts w:ascii="Aptos" w:hAnsi="Aptos"/>
+          <w:b/>
+          <w:sz w:val="18"/>
+        </w:rPr>
+        <w:t xml:space="preserve">AI &amp; Modern Tooling: </w:t>
+      </w:r>
+      <w:r>
+        <w:rPr>
+          <w:rFonts w:ascii="Aptos" w:hAnsi="Aptos"/>
+          <w:b w:val="0"/>
+          <w:sz w:val="18"/>
+        </w:rPr>
+        <w:t>Claude, OpenAI Codex, AI-assisted architecture, code refactoring, test generation, and prompt workflows (2024 - Present)</w:t>
+      </w:r>
+    </w:p>
+    <w:p>
+      <w:pPr>
+        <w:spacing w:before="20" w:after="40" w:line="276" w:lineRule="auto"/>
+      </w:pPr>
+      <w:r/>
+      <w:r>
+        <w:rPr>
+          <w:rFonts w:ascii="Aptos" w:hAnsi="Aptos"/>
+          <w:b/>
+          <w:sz w:val="18"/>
+        </w:rPr>
+        <w:t xml:space="preserve">Infrastructure &amp; Systems: </w:t>
+      </w:r>
+      <w:r>
+        <w:rPr>
+          <w:rFonts w:ascii="Aptos" w:hAnsi="Aptos"/>
+          <w:b w:val="0"/>
+          <w:sz w:val="18"/>
+        </w:rPr>
+        <w:t>Linux, Ubuntu, Windows Server, Apache, Nginx, Proxmox, virtual machines, Samba/CIFS, XAMPP/LAMPP, DNS, Composer, npm</w:t>
+      </w:r>
+    </w:p>
+    <w:p>
+      <w:pPr>
+        <w:spacing w:before="20" w:after="40" w:line="276" w:lineRule="auto"/>
+      </w:pPr>
+      <w:r/>
+      <w:r>
+        <w:rPr>
+          <w:rFonts w:ascii="Aptos" w:hAnsi="Aptos"/>
+          <w:b/>
+          <w:sz w:val="18"/>
         </w:rPr>
         <w:t xml:space="preserve">Specialized &amp; .NET: </w:t>
       </w:r>
       <w:r>
         <w:rPr>
+          <w:rFonts w:ascii="Aptos" w:hAnsi="Aptos"/>
+          <w:b w:val="0"/>
           <w:sz w:val="18"/>
         </w:rPr>
-        <w:t>Unity3D, C#, TensorFlow.js, COCO-SSD, Webcam API, QR/barcode systems, Chart.js, Nextcloud, ASP.NET, VB.NET, Visual Basic 6</w:t>
+        <w:t>Unity3D, C#, Mobile Development, QR/barcode systems, Chart.js, Nextcloud, ASP.NET, VB.NET, Visual Basic 6</w:t>
       </w:r>
     </w:p>
     <w:p>
@@ -274,46 +360,44 @@
     <w:p>
       <w:pPr>
         <w:keepNext/>
-        <w:spacing w:after="60"/>
+        <w:spacing w:after="60" w:before="0"/>
       </w:pPr>
+      <w:r/>
       <w:r>
         <w:rPr>
+          <w:rFonts w:ascii="Aptos" w:hAnsi="Aptos"/>
           <w:b/>
           <w:color w:val="2359A8"/>
+          <w:sz w:val="19"/>
         </w:rPr>
-        <w:t>INC (Private)</w:t>
+        <w:t>New Era University</w:t>
       </w:r>
       <w:r>
         <w:rPr>
-          <w:i/>
+          <w:rFonts w:ascii="Aptos" w:hAnsi="Aptos"/>
           <w:color w:val="52605C"/>
+          <w:sz w:val="18"/>
         </w:rPr>
-        <w:t xml:space="preserve"> | Philippines</w:t>
+        <w:t xml:space="preserve"> | No. 9, Central Avenue, New Era, Quezon City, Philippines, 1107</w:t>
       </w:r>
     </w:p>
     <w:p>
       <w:pPr>
         <w:pStyle w:val="ResumeBullet"/>
-        <w:keepLines/>
-        <w:spacing w:after="40"/>
-        <w:ind w:left="259" w:hanging="173"/>
+        <w:spacing w:before="0" w:after="40"/>
       </w:pPr>
       <w:r>
-        <w:rPr>
-          <w:sz w:val="18"/>
-        </w:rPr>
-        <w:t>Designed, developed, deployed, and maintained 10 major internal platforms spanning dashboards, inventory, personnel, documents, visitors, reservations, access control, integrations, kiosks, and computer vision.</w:t>
+        <w:t>Designed, developed, deployed, and maintained 14 major internal platforms spanning dashboards, inventory, personnel, documents, correspondence, directory sync, hymns and media, visitors, access control, integrations, kiosks, and mobile applications. spanning dashboards, inventory, personnel, documents, visitors, reservations, access control, integrations, kiosks, hymns and media, and mobile applications.</w:t>
       </w:r>
     </w:p>
     <w:p>
       <w:pPr>
         <w:pStyle w:val="ResumeBullet"/>
-        <w:keepLines/>
-        <w:spacing w:after="40"/>
-        <w:ind w:left="259" w:hanging="173"/>
+        <w:spacing w:before="0" w:after="40"/>
       </w:pPr>
       <w:r>
         <w:rPr>
+          <w:rFonts w:ascii="Aptos" w:hAnsi="Aptos"/>
           <w:sz w:val="18"/>
         </w:rPr>
         <w:t>Built full-stack applications using PHP, Laravel, JavaScript, React, MySQL/MariaDB, PostgreSQL, REST APIs, AJAX, authentication, and role-based access control.</w:t>
@@ -322,29 +406,67 @@
     <w:p>
       <w:pPr>
         <w:pStyle w:val="ResumeBullet"/>
-        <w:keepLines/>
-        <w:spacing w:after="40"/>
-        <w:ind w:left="259" w:hanging="173"/>
+        <w:spacing w:before="0" w:after="40"/>
       </w:pPr>
       <w:r>
         <w:rPr>
+          <w:rFonts w:ascii="Aptos" w:hAnsi="Aptos"/>
           <w:sz w:val="18"/>
         </w:rPr>
-        <w:t>Delivered specialized solutions using Unity/C#, TensorFlow.js, COCO-SSD, webcams, QR/barcode workflows, Nextcloud APIs, Chart.js, and network-shared storage.</w:t>
+        <w:t>Leveraged Docker for application containerization, GitHub for version control, and deployed modern cloud and serverless components using Vercel and Firebase.</w:t>
       </w:r>
     </w:p>
     <w:p>
       <w:pPr>
         <w:pStyle w:val="ResumeBullet"/>
-        <w:keepLines/>
-        <w:spacing w:after="40"/>
-        <w:ind w:left="259" w:hanging="173"/>
+        <w:spacing w:before="0" w:after="40"/>
       </w:pPr>
       <w:r>
         <w:rPr>
+          <w:rFonts w:ascii="Aptos" w:hAnsi="Aptos"/>
+          <w:sz w:val="18"/>
+        </w:rPr>
+        <w:t>Actively integrated AI tools from 2024 to present, practicing the proper and responsible use of AI tools (including Claude, OpenAI Codex, and modern AI coding assistants) to accelerate architectural design, code generation, refactoring, test coverage, and complex debugging.</w:t>
+      </w:r>
+    </w:p>
+    <w:p>
+      <w:pPr>
+        <w:pStyle w:val="ResumeBullet"/>
+        <w:spacing w:before="0" w:after="40"/>
+      </w:pPr>
+      <w:r>
+        <w:rPr>
+          <w:rFonts w:ascii="Aptos" w:hAnsi="Aptos"/>
+          <w:sz w:val="18"/>
+        </w:rPr>
+        <w:t>Delivered specialized solutions using Unity/C#, mobile applications, QR/barcode workflows, Nextcloud APIs, Chart.js, and network-shared storage.</w:t>
+      </w:r>
+    </w:p>
+    <w:p>
+      <w:pPr>
+        <w:pStyle w:val="ResumeBullet"/>
+        <w:spacing w:before="0" w:after="40"/>
+      </w:pPr>
+      <w:r>
+        <w:rPr>
+          <w:rFonts w:ascii="Aptos" w:hAnsi="Aptos"/>
           <w:sz w:val="18"/>
         </w:rPr>
         <w:t>Owned the complete lifecycle from requirements and database design through Linux deployment, Apache/Nginx configuration, Proxmox environments, troubleshooting, and production maintenance.</w:t>
+      </w:r>
+    </w:p>
+    <w:p>
+      <w:pPr>
+        <w:pStyle w:val="ResumeBullet"/>
+        <w:spacing w:before="0" w:after="40"/>
+      </w:pPr>
+      <w:r>
+        <w:rPr>
+          <w:rFonts w:ascii="Aptos" w:hAnsi="Aptos"/>
+          <w:i/>
+          <w:sz w:val="18"/>
+        </w:rPr>
+        <w:t>Alongside engineering, I serve as a part-time programming teacher at SFM School, mentoring students from fundamental programming logic and data requirements gathering through active development, testing, deployment, and practical implementation.</w:t>
       </w:r>
     </w:p>
     <w:p>
@@ -629,16 +751,18 @@
         <w:keepNext/>
         <w:spacing w:before="120" w:after="20"/>
       </w:pPr>
+      <w:r/>
       <w:r>
         <w:rPr>
+          <w:rFonts w:ascii="Aptos" w:hAnsi="Aptos"/>
           <w:b/>
           <w:sz w:val="20"/>
         </w:rPr>
-        <w:t>PMD Dashboard</w:t>
+        <w:t>PMD Dashboard (INC Administrative Platform)</w:t>
       </w:r>
       <w:r>
         <w:rPr>
-          <w:i/>
+          <w:rFonts w:ascii="Aptos" w:hAnsi="Aptos"/>
           <w:color w:val="52605C"/>
           <w:sz w:val="18"/>
         </w:rPr>
@@ -652,9 +776,9 @@
       </w:pPr>
       <w:r>
         <w:rPr>
-          <w:sz w:val="18"/>
+          <w:rFonts w:ascii="Aptos" w:hAnsi="Aptos"/>
         </w:rPr>
-        <w:t>Centralized multi-application dashboard for internal access, operational information, reminders, events, inventory, and administration.</w:t>
+        <w:t>Centralized administrative platform designed to streamline personnel management, enrollment processes, and reporting across complex family and educational data structures.</w:t>
       </w:r>
     </w:p>
     <w:p>
@@ -666,9 +790,10 @@
       </w:pPr>
       <w:r>
         <w:rPr>
+          <w:rFonts w:ascii="Aptos" w:hAnsi="Aptos"/>
           <w:sz w:val="18"/>
         </w:rPr>
-        <w:t>Implemented authentication, session management, group/application permission mapping, account administration, announcements, reminders, events, dashboard metrics, search, filtering, pagination, and audit logs.</w:t>
+        <w:t>Architected dynamic web interface using React.js, Chakra UI, Framer Motion, and React Router; built Node.js/Express backend APIs handling multi-step enrollment workflows, family record relationships, and administrative analytics.</w:t>
       </w:r>
     </w:p>
     <w:p>
@@ -678,31 +803,23 @@
         <w:spacing w:after="40"/>
         <w:ind w:left="259" w:hanging="173"/>
       </w:pPr>
+      <w:r/>
       <w:r>
         <w:rPr>
-          <w:sz w:val="18"/>
-        </w:rPr>
-        <w:t>Integrated multiple internal applications, supported domain migration and server configuration, and resolved frontend, backend, database, session, and AJAX issues.</w:t>
-      </w:r>
-    </w:p>
-    <w:p>
-      <w:pPr>
-        <w:keepLines/>
-        <w:spacing w:after="60"/>
-      </w:pPr>
-      <w:r>
-        <w:rPr>
+          <w:rFonts w:ascii="Aptos" w:hAnsi="Aptos"/>
           <w:b/>
           <w:color w:val="087F5B"/>
+          <w:sz w:val="17"/>
         </w:rPr>
         <w:t xml:space="preserve">Technologies: </w:t>
       </w:r>
       <w:r>
         <w:rPr>
+          <w:rFonts w:ascii="Aptos" w:hAnsi="Aptos"/>
           <w:color w:val="52605C"/>
           <w:sz w:val="17"/>
         </w:rPr>
-        <w:t>PHP, JavaScript, jQuery, AJAX, MySQL/MariaDB, HTML5, CSS3, Bootstrap, Apache</w:t>
+        <w:t>React.js, Node.js, Express, Chakra UI, Framer Motion, React Router DOM, MySQL</w:t>
       </w:r>
     </w:p>
     <w:p>
@@ -791,20 +908,20 @@
         <w:keepNext/>
         <w:spacing w:before="120" w:after="20"/>
       </w:pPr>
+      <w:r/>
       <w:r>
         <w:rPr>
           <w:b/>
           <w:sz w:val="20"/>
         </w:rPr>
-        <w:t>PWPDS Object Detection &amp; Inventory System</w:t>
+        <w:t>Hymns Application</w:t>
       </w:r>
       <w:r>
         <w:rPr>
-          <w:i/>
           <w:color w:val="52605C"/>
           <w:sz w:val="18"/>
         </w:rPr>
-        <w:t xml:space="preserve"> | Full-Stack / Computer Vision Developer</w:t>
+        <w:t xml:space="preserve"> | Laravel Full-Stack Developer</w:t>
       </w:r>
     </w:p>
     <w:p>
@@ -812,11 +929,12 @@
         <w:keepLines/>
         <w:spacing w:after="40"/>
       </w:pPr>
+      <w:r/>
       <w:r>
         <w:rPr>
           <w:sz w:val="18"/>
         </w:rPr>
-        <w:t>Browser-based computer-vision application that detects objects through a webcam and registers them as managed inventory assets.</w:t>
+        <w:t>Centralized web-based hymnal and media platform for managing, searching, viewing, and presenting hymns, musical arrangements, and liturgical lyrics.</w:t>
       </w:r>
     </w:p>
     <w:p>
@@ -826,11 +944,12 @@
         <w:spacing w:after="40"/>
         <w:ind w:left="259" w:hanging="173"/>
       </w:pPr>
+      <w:r/>
       <w:r>
         <w:rPr>
           <w:sz w:val="18"/>
         </w:rPr>
-        <w:t>Integrated real-time object detection, automatic image capture, inventory records, categories, item status, borrowing/return workflows, dashboards, filters, image previews, and Excel export.</w:t>
+        <w:t>Designed relational database schemas for hymns, categories, verses, musical notations, and metadata; implemented complete CRUD operations, category filtering, and instant search by number, title, and lyrics.</w:t>
       </w:r>
     </w:p>
     <w:p>
@@ -840,11 +959,12 @@
         <w:spacing w:after="40"/>
         <w:ind w:left="259" w:hanging="173"/>
       </w:pPr>
+      <w:r/>
       <w:r>
         <w:rPr>
           <w:sz w:val="18"/>
         </w:rPr>
-        <w:t>Designed database structures and resolved image storage, decimal, datetime, and validation issues.</w:t>
+        <w:t>Developed responsive Blade interfaces, dynamic lyrics presentation views, audio/media attachment handling, and role-based administrative access.</w:t>
       </w:r>
     </w:p>
     <w:p>
@@ -852,6 +972,7 @@
         <w:keepLines/>
         <w:spacing w:after="60"/>
       </w:pPr>
+      <w:r/>
       <w:r>
         <w:rPr>
           <w:b/>
@@ -864,7 +985,7 @@
           <w:color w:val="52605C"/>
           <w:sz w:val="17"/>
         </w:rPr>
-        <w:t>PHP, JavaScript, TensorFlow.js, COCO-SSD, MySQL, HTML5, CSS3, Webcam API</w:t>
+        <w:t>Laravel, PHP, MySQL, Blade, JavaScript, Bootstrap</w:t>
       </w:r>
     </w:p>
     <w:p>
@@ -1084,6 +1205,75 @@
     </w:p>
     <w:p>
       <w:pPr>
+        <w:spacing w:after="40"/>
+      </w:pPr>
+      <w:r>
+        <w:rPr>
+          <w:b/>
+          <w:sz w:val="20"/>
+        </w:rPr>
+        <w:t>Hero System - Mobile App Version</w:t>
+      </w:r>
+      <w:r>
+        <w:rPr>
+          <w:color w:val="52605C"/>
+          <w:sz w:val="18"/>
+        </w:rPr>
+        <w:t xml:space="preserve"> | Unity / Mobile Developer</w:t>
+      </w:r>
+    </w:p>
+    <w:p>
+      <w:pPr/>
+      <w:r>
+        <w:rPr>
+          <w:sz w:val="18"/>
+        </w:rPr>
+        <w:t>Cross-platform mobile companion application extending the Hero System event experience, participant progression, and interactive multimedia to mobile devices.</w:t>
+      </w:r>
+    </w:p>
+    <w:p>
+      <w:pPr>
+        <w:pStyle w:val="ResumeBullet"/>
+      </w:pPr>
+      <w:r>
+        <w:rPr>
+          <w:sz w:val="18"/>
+        </w:rPr>
+        <w:t>Developed interactive mobile progression workflows, participant profile state, QR code scanning, media playback, local caching, and backend API synchronization using Unity3D and C#.</w:t>
+      </w:r>
+    </w:p>
+    <w:p>
+      <w:pPr>
+        <w:pStyle w:val="ResumeBullet"/>
+      </w:pPr>
+      <w:r>
+        <w:rPr>
+          <w:sz w:val="18"/>
+        </w:rPr>
+        <w:t>Optimized mobile performance, touch interactions, responsive layouts, and cross-platform Android/iOS runtime compatibility.</w:t>
+      </w:r>
+    </w:p>
+    <w:p>
+      <w:pPr>
+        <w:spacing w:after="120"/>
+      </w:pPr>
+      <w:r>
+        <w:rPr>
+          <w:b/>
+          <w:color w:val="087F5B"/>
+        </w:rPr>
+        <w:t xml:space="preserve">Technologies: </w:t>
+      </w:r>
+      <w:r>
+        <w:rPr>
+          <w:color w:val="52605C"/>
+          <w:sz w:val="17"/>
+        </w:rPr>
+        <w:t>Unity3D, C#, Mobile, REST APIs, JSON, MySQL</w:t>
+      </w:r>
+    </w:p>
+    <w:p>
+      <w:pPr>
         <w:keepNext/>
         <w:spacing w:before="120" w:after="20"/>
       </w:pPr>
@@ -1218,69 +1408,209 @@
     </w:p>
     <w:p>
       <w:pPr>
-        <w:keepNext/>
-        <w:spacing w:before="120" w:after="20"/>
+        <w:spacing w:before="160" w:after="40"/>
       </w:pPr>
       <w:r>
         <w:rPr>
+          <w:rFonts w:ascii="Aptos" w:hAnsi="Aptos"/>
           <w:b/>
           <w:sz w:val="20"/>
         </w:rPr>
-        <w:t>Guest Registration &amp; Reservation System</w:t>
+        <w:t>LMS 2.0 - Letter Management System</w:t>
       </w:r>
       <w:r>
         <w:rPr>
-          <w:i/>
+          <w:rFonts w:ascii="Aptos" w:hAnsi="Aptos"/>
           <w:color w:val="52605C"/>
           <w:sz w:val="18"/>
         </w:rPr>
-        <w:t xml:space="preserve"> | Full-Stack Developer</w:t>
+        <w:t xml:space="preserve"> | Full-Stack / Workflow Developer</w:t>
       </w:r>
     </w:p>
     <w:p>
       <w:pPr>
-        <w:keepLines/>
-        <w:spacing w:after="40"/>
+        <w:spacing w:before="0" w:after="40"/>
       </w:pPr>
       <w:r>
         <w:rPr>
+          <w:rFonts w:ascii="Aptos" w:hAnsi="Aptos"/>
+          <w:color w:val="52605C"/>
           <w:sz w:val="18"/>
         </w:rPr>
-        <w:t>Event-related registration platform supporting reservations and structured guest information.</w:t>
+        <w:t>Centralized correspondence platform for registering, routing, endorsing, tracking, and archiving official organizational letters.</w:t>
       </w:r>
     </w:p>
     <w:p>
       <w:pPr>
         <w:pStyle w:val="ResumeBullet"/>
-        <w:keepLines/>
-        <w:spacing w:after="40"/>
-        <w:ind w:left="259" w:hanging="173"/>
+        <w:spacing w:before="0" w:after="40"/>
       </w:pPr>
       <w:r>
         <w:rPr>
+          <w:rFonts w:ascii="Aptos" w:hAnsi="Aptos"/>
           <w:sz w:val="18"/>
         </w:rPr>
-        <w:t>Built registration forms, automatic control numbers, date/time reservations, lookup by reservation date, validation, database workflows, Excel import/export, and dynamic data loading.</w:t>
+        <w:t>Developed end-to-end correspondence logging, multi-stage endorsement and routing workflows, status tracking, shared file-backed storage, and document archiving.</w:t>
       </w:r>
     </w:p>
     <w:p>
       <w:pPr>
-        <w:keepLines/>
-        <w:spacing w:after="60"/>
+        <w:spacing w:before="20" w:after="80"/>
       </w:pPr>
       <w:r>
         <w:rPr>
+          <w:rFonts w:ascii="Aptos" w:hAnsi="Aptos"/>
           <w:b/>
           <w:color w:val="087F5B"/>
+          <w:sz w:val="17"/>
         </w:rPr>
         <w:t xml:space="preserve">Technologies: </w:t>
       </w:r>
       <w:r>
         <w:rPr>
+          <w:rFonts w:ascii="Aptos" w:hAnsi="Aptos"/>
           <w:color w:val="52605C"/>
           <w:sz w:val="17"/>
         </w:rPr>
-        <w:t>PHP, MySQL, JavaScript, AJAX, Excel</w:t>
+        <w:t>React 18, Node.js, Express.js, Tailwind CSS, Directus, Docker, SQLite</w:t>
+      </w:r>
+    </w:p>
+    <w:p>
+      <w:pPr>
+        <w:spacing w:before="160" w:after="40"/>
+      </w:pPr>
+      <w:r>
+        <w:rPr>
+          <w:rFonts w:ascii="Aptos" w:hAnsi="Aptos"/>
+          <w:b/>
+          <w:sz w:val="20"/>
+        </w:rPr>
+        <w:t>TRG Personnel Information System</w:t>
+      </w:r>
+      <w:r>
+        <w:rPr>
+          <w:rFonts w:ascii="Aptos" w:hAnsi="Aptos"/>
+          <w:color w:val="52605C"/>
+          <w:sz w:val="18"/>
+        </w:rPr>
+        <w:t xml:space="preserve"> | Laravel Full-Stack Developer</w:t>
+      </w:r>
+    </w:p>
+    <w:p>
+      <w:pPr>
+        <w:spacing w:before="0" w:after="40"/>
+      </w:pPr>
+      <w:r>
+        <w:rPr>
+          <w:rFonts w:ascii="Aptos" w:hAnsi="Aptos"/>
+          <w:color w:val="52605C"/>
+          <w:sz w:val="18"/>
+        </w:rPr>
+        <w:t>Relational personnel management platform for tracking TRG profiles, service assignments, credentials, and organizational records.</w:t>
+      </w:r>
+    </w:p>
+    <w:p>
+      <w:pPr>
+        <w:pStyle w:val="ResumeBullet"/>
+        <w:spacing w:before="0" w:after="40"/>
+      </w:pPr>
+      <w:r>
+        <w:rPr>
+          <w:rFonts w:ascii="Aptos" w:hAnsi="Aptos"/>
+          <w:sz w:val="18"/>
+        </w:rPr>
+        <w:t>Built relational schema architecture, personnel profile CRUD workflows, departmental role assignments, document attachments, search filters, and reporting exports.</w:t>
+      </w:r>
+    </w:p>
+    <w:p>
+      <w:pPr>
+        <w:spacing w:before="20" w:after="80"/>
+      </w:pPr>
+      <w:r>
+        <w:rPr>
+          <w:rFonts w:ascii="Aptos" w:hAnsi="Aptos"/>
+          <w:b/>
+          <w:color w:val="087F5B"/>
+          <w:sz w:val="17"/>
+        </w:rPr>
+        <w:t xml:space="preserve">Technologies: </w:t>
+      </w:r>
+      <w:r>
+        <w:rPr>
+          <w:rFonts w:ascii="Aptos" w:hAnsi="Aptos"/>
+          <w:color w:val="52605C"/>
+          <w:sz w:val="17"/>
+        </w:rPr>
+        <w:t>Laravel, PHP, MySQL, Blade, Bootstrap</w:t>
+      </w:r>
+    </w:p>
+    <w:p>
+      <w:pPr>
+        <w:spacing w:before="160" w:after="40"/>
+      </w:pPr>
+      <w:r>
+        <w:rPr>
+          <w:rFonts w:ascii="Aptos" w:hAnsi="Aptos"/>
+          <w:b/>
+          <w:sz w:val="20"/>
+        </w:rPr>
+        <w:t>INC Directory Management &amp; Sync System</w:t>
+      </w:r>
+      <w:r>
+        <w:rPr>
+          <w:rFonts w:ascii="Aptos" w:hAnsi="Aptos"/>
+          <w:color w:val="52605C"/>
+          <w:sz w:val="18"/>
+        </w:rPr>
+        <w:t xml:space="preserve"> | Lead / Full-Stack Developer</w:t>
+      </w:r>
+    </w:p>
+    <w:p>
+      <w:pPr>
+        <w:spacing w:before="0" w:after="40"/>
+      </w:pPr>
+      <w:r>
+        <w:rPr>
+          <w:rFonts w:ascii="Aptos" w:hAnsi="Aptos"/>
+          <w:color w:val="52605C"/>
+          <w:sz w:val="18"/>
+        </w:rPr>
+        <w:t>Full-stack synchronization platform to synchronize, enrich, and manage official directory records, locations, and sub-locale relationships.</w:t>
+      </w:r>
+    </w:p>
+    <w:p>
+      <w:pPr>
+        <w:pStyle w:val="ResumeBullet"/>
+        <w:spacing w:before="0" w:after="40"/>
+      </w:pPr>
+      <w:r>
+        <w:rPr>
+          <w:rFonts w:ascii="Aptos" w:hAnsi="Aptos"/>
+          <w:sz w:val="18"/>
+        </w:rPr>
+        <w:t>Engineered automated directory synchronization, data enrichment workflows, interactive Leaflet maps with distance calculations, sub-locale hierarchy tracking, and Dockerized deployment.</w:t>
+      </w:r>
+    </w:p>
+    <w:p>
+      <w:pPr>
+        <w:spacing w:before="20" w:after="80"/>
+      </w:pPr>
+      <w:r>
+        <w:rPr>
+          <w:rFonts w:ascii="Aptos" w:hAnsi="Aptos"/>
+          <w:b/>
+          <w:color w:val="087F5B"/>
+          <w:sz w:val="17"/>
+        </w:rPr>
+        <w:t xml:space="preserve">Technologies: </w:t>
+      </w:r>
+      <w:r>
+        <w:rPr>
+          <w:rFonts w:ascii="Aptos" w:hAnsi="Aptos"/>
+          <w:color w:val="52605C"/>
+          <w:sz w:val="17"/>
+        </w:rPr>
+        <w:t>React 18, Node.js, Express, Sequelize, MySQL, Leaflet, Docker</w:t>
       </w:r>
     </w:p>
     <w:p>
@@ -1348,6 +1678,73 @@
           <w:sz w:val="17"/>
         </w:rPr>
         <w:t>PHP, Laravel, MySQL, RBAC</w:t>
+      </w:r>
+    </w:p>
+    <w:p>
+      <w:pPr>
+        <w:spacing w:before="160" w:after="40"/>
+      </w:pPr>
+      <w:r>
+        <w:rPr>
+          <w:rFonts w:ascii="Aptos" w:hAnsi="Aptos"/>
+          <w:b/>
+          <w:sz w:val="20"/>
+        </w:rPr>
+        <w:t>GLPI Web App - IT Asset &amp; Service Management</w:t>
+      </w:r>
+      <w:r>
+        <w:rPr>
+          <w:rFonts w:ascii="Aptos" w:hAnsi="Aptos"/>
+          <w:color w:val="52605C"/>
+          <w:sz w:val="18"/>
+        </w:rPr>
+        <w:t xml:space="preserve"> | DevOps / Systems Administrator</w:t>
+      </w:r>
+    </w:p>
+    <w:p>
+      <w:pPr>
+        <w:spacing w:before="0" w:after="40"/>
+      </w:pPr>
+      <w:r>
+        <w:rPr>
+          <w:rFonts w:ascii="Aptos" w:hAnsi="Aptos"/>
+        </w:rPr>
+        <w:t>Free open-source IT asset and service management (ITSM) web platform deployed and hosted on a virtualized Proxmox VE server.</w:t>
+      </w:r>
+    </w:p>
+    <w:p>
+      <w:pPr>
+        <w:pStyle w:val="ResumeBullet"/>
+        <w:spacing w:before="0" w:after="40"/>
+      </w:pPr>
+      <w:r>
+        <w:rPr>
+          <w:rFonts w:ascii="Aptos" w:hAnsi="Aptos"/>
+          <w:sz w:val="18"/>
+        </w:rPr>
+        <w:t>Provisioned virtualized environment on Proxmox VE, hardened Linux instance, configured Apache web server and MariaDB database, and deployed GLPI for organization-wide asset inventory, helpdesk ticketing, and system monitoring.</w:t>
+      </w:r>
+    </w:p>
+    <w:p>
+      <w:pPr>
+        <w:spacing w:before="20" w:after="80"/>
+      </w:pPr>
+      <w:r>
+        <w:rPr>
+          <w:rFonts w:ascii="Aptos" w:hAnsi="Aptos"/>
+          <w:b/>
+          <w:color w:val="087F5B"/>
+          <w:sz w:val="17"/>
+        </w:rPr>
+        <w:t xml:space="preserve">Technologies: </w:t>
+      </w:r>
+      <w:r>
+        <w:rPr>
+          <w:rFonts w:ascii="Aptos" w:hAnsi="Aptos"/>
+          <w:color w:val="52605C"/>
+          <w:sz w:val="17"/>
+        </w:rPr>
+        <w:t>GLPI (Open-Source ITSM), Proxmox VE, Linux, Apache, MariaDB/MySQL, PHP</w:t>
       </w:r>
     </w:p>
     <w:p>
@@ -1444,17 +1841,24 @@
     </w:p>
     <w:p>
       <w:pPr>
-        <w:spacing w:after="40"/>
+        <w:spacing w:after="40" w:before="80"/>
       </w:pPr>
+      <w:r/>
       <w:r>
         <w:rPr>
+          <w:rFonts w:ascii="Aptos" w:hAnsi="Aptos"/>
           <w:b/>
           <w:sz w:val="21"/>
         </w:rPr>
         <w:t>Bachelor's Degree in Computer Science</w:t>
       </w:r>
       <w:r>
-        <w:t xml:space="preserve"> | New Era University, Philippines | Graduated April 13, 2011</w:t>
+        <w:rPr>
+          <w:rFonts w:ascii="Aptos" w:hAnsi="Aptos"/>
+          <w:color w:val="52605C"/>
+          <w:sz w:val="18"/>
+        </w:rPr>
+        <w:t xml:space="preserve"> | New Era University (No. 9, Central Avenue, New Era, Quezon City, Philippines, 1107) | Graduated April 13, 2011</w:t>
       </w:r>
     </w:p>
     <w:p>
@@ -1511,6 +1915,503 @@
         <w:t>End-to-end application ownership | Requirements translation | Database and application architecture | Legacy maintenance and modernization | API and third-party integration | Cross-platform Windows/Linux development | Production troubleshooting | Security and access control | UI/UX improvement | Independent technical problem solving</w:t>
       </w:r>
     </w:p>
+    <w:p>
+      <w:pPr>
+        <w:spacing w:before="200" w:after="100"/>
+      </w:pPr>
+      <w:r>
+        <w:rPr>
+          <w:rFonts w:ascii="Aptos" w:hAnsi="Aptos"/>
+          <w:b/>
+          <w:color w:val="087F5B"/>
+          <w:sz w:val="20"/>
+        </w:rPr>
+        <w:t>PERSONAL PARTICULARS</w:t>
+      </w:r>
+    </w:p>
+    <w:tbl>
+      <w:tblPr>
+        <w:tblW w:type="auto" w:w="0"/>
+        <w:jc w:val="center"/>
+        <w:tblLayout w:type="fixed"/>
+        <w:tblLook w:firstColumn="1" w:firstRow="1" w:lastColumn="0" w:lastRow="0" w:noHBand="0" w:noVBand="1" w:val="04A0"/>
+      </w:tblPr>
+      <w:tblGrid>
+        <w:gridCol w:w="5285"/>
+        <w:gridCol w:w="5285"/>
+      </w:tblGrid>
+      <w:tr>
+        <w:tc>
+          <w:tcPr>
+            <w:tcW w:type="dxa" w:w="5285"/>
+          </w:tcPr>
+          <w:p>
+            <w:pPr>
+              <w:spacing w:before="20" w:after="20" w:line="276" w:lineRule="auto"/>
+            </w:pPr>
+            <w:r>
+              <w:rPr>
+                <w:rFonts w:ascii="Aptos" w:hAnsi="Aptos"/>
+                <w:b/>
+                <w:color w:val="17211F"/>
+                <w:sz w:val="18"/>
+              </w:rPr>
+              <w:t xml:space="preserve">Date of Birth: </w:t>
+            </w:r>
+            <w:r>
+              <w:rPr>
+                <w:rFonts w:ascii="Aptos" w:hAnsi="Aptos"/>
+                <w:b w:val="0"/>
+                <w:color w:val="52605C"/>
+                <w:sz w:val="18"/>
+              </w:rPr>
+              <w:t>9 Nov 1990</w:t>
+            </w:r>
+          </w:p>
+        </w:tc>
+        <w:tc>
+          <w:tcPr>
+            <w:tcW w:type="dxa" w:w="5285"/>
+          </w:tcPr>
+          <w:p>
+            <w:pPr>
+              <w:spacing w:before="20" w:after="20" w:line="276" w:lineRule="auto"/>
+            </w:pPr>
+            <w:r>
+              <w:rPr>
+                <w:rFonts w:ascii="Aptos" w:hAnsi="Aptos"/>
+                <w:b/>
+                <w:color w:val="17211F"/>
+                <w:sz w:val="18"/>
+              </w:rPr>
+              <w:t xml:space="preserve">Nationality: </w:t>
+            </w:r>
+            <w:r>
+              <w:rPr>
+                <w:rFonts w:ascii="Aptos" w:hAnsi="Aptos"/>
+                <w:b w:val="0"/>
+                <w:color w:val="52605C"/>
+                <w:sz w:val="18"/>
+              </w:rPr>
+              <w:t>Filipino</w:t>
+            </w:r>
+          </w:p>
+        </w:tc>
+      </w:tr>
+      <w:tr>
+        <w:tc>
+          <w:tcPr>
+            <w:tcW w:type="dxa" w:w="5285"/>
+          </w:tcPr>
+          <w:p>
+            <w:pPr>
+              <w:spacing w:before="20" w:after="20" w:line="276" w:lineRule="auto"/>
+            </w:pPr>
+            <w:r>
+              <w:rPr>
+                <w:rFonts w:ascii="Aptos" w:hAnsi="Aptos"/>
+                <w:b/>
+                <w:color w:val="17211F"/>
+                <w:sz w:val="18"/>
+              </w:rPr>
+              <w:t xml:space="preserve">Age: </w:t>
+            </w:r>
+            <w:r>
+              <w:rPr>
+                <w:rFonts w:ascii="Aptos" w:hAnsi="Aptos"/>
+                <w:b w:val="0"/>
+                <w:color w:val="52605C"/>
+                <w:sz w:val="18"/>
+              </w:rPr>
+              <w:t>35 years 9 month(s)</w:t>
+            </w:r>
+          </w:p>
+        </w:tc>
+        <w:tc>
+          <w:tcPr>
+            <w:tcW w:type="dxa" w:w="5285"/>
+          </w:tcPr>
+          <w:p>
+            <w:pPr>
+              <w:spacing w:before="20" w:after="20" w:line="276" w:lineRule="auto"/>
+            </w:pPr>
+            <w:r>
+              <w:rPr>
+                <w:rFonts w:ascii="Aptos" w:hAnsi="Aptos"/>
+                <w:b/>
+                <w:color w:val="17211F"/>
+                <w:sz w:val="18"/>
+              </w:rPr>
+              <w:t xml:space="preserve">Religion: </w:t>
+            </w:r>
+            <w:r>
+              <w:rPr>
+                <w:rFonts w:ascii="Aptos" w:hAnsi="Aptos"/>
+                <w:b w:val="0"/>
+                <w:color w:val="52605C"/>
+                <w:sz w:val="18"/>
+              </w:rPr>
+              <w:t>IGLESIA NI CRISTO (INC)</w:t>
+            </w:r>
+          </w:p>
+        </w:tc>
+      </w:tr>
+      <w:tr>
+        <w:tc>
+          <w:tcPr>
+            <w:tcW w:type="dxa" w:w="5285"/>
+          </w:tcPr>
+          <w:p>
+            <w:pPr>
+              <w:spacing w:before="20" w:after="20" w:line="276" w:lineRule="auto"/>
+            </w:pPr>
+            <w:r>
+              <w:rPr>
+                <w:rFonts w:ascii="Aptos" w:hAnsi="Aptos"/>
+                <w:b/>
+                <w:color w:val="17211F"/>
+                <w:sz w:val="18"/>
+              </w:rPr>
+              <w:t xml:space="preserve">Place of Birth: </w:t>
+            </w:r>
+            <w:r>
+              <w:rPr>
+                <w:rFonts w:ascii="Aptos" w:hAnsi="Aptos"/>
+                <w:b w:val="0"/>
+                <w:color w:val="52605C"/>
+                <w:sz w:val="18"/>
+              </w:rPr>
+              <w:t>Frisco Quezon City</w:t>
+            </w:r>
+          </w:p>
+        </w:tc>
+        <w:tc>
+          <w:tcPr>
+            <w:tcW w:type="dxa" w:w="5285"/>
+          </w:tcPr>
+          <w:p>
+            <w:pPr>
+              <w:spacing w:before="20" w:after="20" w:line="276" w:lineRule="auto"/>
+            </w:pPr>
+            <w:r>
+              <w:rPr>
+                <w:rFonts w:ascii="Aptos" w:hAnsi="Aptos"/>
+                <w:b/>
+                <w:color w:val="17211F"/>
+                <w:sz w:val="18"/>
+              </w:rPr>
+              <w:t xml:space="preserve">Marital Status: </w:t>
+            </w:r>
+            <w:r>
+              <w:rPr>
+                <w:rFonts w:ascii="Aptos" w:hAnsi="Aptos"/>
+                <w:b w:val="0"/>
+                <w:color w:val="52605C"/>
+                <w:sz w:val="18"/>
+              </w:rPr>
+              <w:t>Single</w:t>
+            </w:r>
+          </w:p>
+        </w:tc>
+      </w:tr>
+      <w:tr>
+        <w:tc>
+          <w:tcPr>
+            <w:tcW w:type="dxa" w:w="5285"/>
+          </w:tcPr>
+          <w:p>
+            <w:pPr>
+              <w:spacing w:before="20" w:after="20" w:line="276" w:lineRule="auto"/>
+            </w:pPr>
+            <w:r>
+              <w:rPr>
+                <w:rFonts w:ascii="Aptos" w:hAnsi="Aptos"/>
+                <w:b/>
+                <w:color w:val="17211F"/>
+                <w:sz w:val="18"/>
+              </w:rPr>
+              <w:t xml:space="preserve">Gender: </w:t>
+            </w:r>
+            <w:r>
+              <w:rPr>
+                <w:rFonts w:ascii="Aptos" w:hAnsi="Aptos"/>
+                <w:b w:val="0"/>
+                <w:color w:val="52605C"/>
+                <w:sz w:val="18"/>
+              </w:rPr>
+              <w:t>Male</w:t>
+            </w:r>
+          </w:p>
+        </w:tc>
+        <w:tc>
+          <w:tcPr>
+            <w:tcW w:type="dxa" w:w="5285"/>
+          </w:tcPr>
+          <w:p>
+            <w:pPr>
+              <w:spacing w:before="20" w:after="20" w:line="276" w:lineRule="auto"/>
+            </w:pPr>
+            <w:r>
+              <w:rPr>
+                <w:rFonts w:ascii="Aptos" w:hAnsi="Aptos"/>
+                <w:b/>
+                <w:color w:val="17211F"/>
+                <w:sz w:val="18"/>
+              </w:rPr>
+              <w:t xml:space="preserve">Permanent Residence: </w:t>
+            </w:r>
+            <w:r>
+              <w:rPr>
+                <w:rFonts w:ascii="Aptos" w:hAnsi="Aptos"/>
+                <w:b w:val="0"/>
+                <w:color w:val="52605C"/>
+                <w:sz w:val="18"/>
+              </w:rPr>
+              <w:t>Philippines</w:t>
+            </w:r>
+          </w:p>
+        </w:tc>
+      </w:tr>
+      <w:tr>
+        <w:tc>
+          <w:tcPr>
+            <w:tcW w:type="dxa" w:w="5285"/>
+          </w:tcPr>
+          <w:p>
+            <w:pPr>
+              <w:spacing w:before="20" w:after="20" w:line="276" w:lineRule="auto"/>
+            </w:pPr>
+            <w:r>
+              <w:rPr>
+                <w:rFonts w:ascii="Aptos" w:hAnsi="Aptos"/>
+                <w:b/>
+                <w:color w:val="17211F"/>
+                <w:sz w:val="18"/>
+              </w:rPr>
+              <w:t xml:space="preserve">Height: </w:t>
+            </w:r>
+            <w:r>
+              <w:rPr>
+                <w:rFonts w:ascii="Aptos" w:hAnsi="Aptos"/>
+                <w:b w:val="0"/>
+                <w:color w:val="52605C"/>
+                <w:sz w:val="18"/>
+              </w:rPr>
+              <w:t>5’10’’</w:t>
+            </w:r>
+          </w:p>
+        </w:tc>
+        <w:tc>
+          <w:tcPr>
+            <w:tcW w:type="dxa" w:w="5285"/>
+          </w:tcPr>
+          <w:p>
+            <w:pPr>
+              <w:spacing w:before="20" w:after="20" w:line="276" w:lineRule="auto"/>
+            </w:pPr>
+            <w:r>
+              <w:rPr>
+                <w:rFonts w:ascii="Aptos" w:hAnsi="Aptos"/>
+                <w:b/>
+                <w:color w:val="17211F"/>
+                <w:sz w:val="18"/>
+              </w:rPr>
+              <w:t xml:space="preserve">Languages Spoken: </w:t>
+            </w:r>
+            <w:r>
+              <w:rPr>
+                <w:rFonts w:ascii="Aptos" w:hAnsi="Aptos"/>
+                <w:b w:val="0"/>
+                <w:color w:val="52605C"/>
+                <w:sz w:val="18"/>
+              </w:rPr>
+              <w:t>English, Tagalog</w:t>
+            </w:r>
+          </w:p>
+        </w:tc>
+      </w:tr>
+    </w:tbl>
+    <w:p>
+      <w:pPr>
+        <w:spacing w:before="200" w:after="100"/>
+      </w:pPr>
+      <w:r>
+        <w:rPr>
+          <w:rFonts w:ascii="Aptos" w:hAnsi="Aptos"/>
+          <w:b/>
+          <w:color w:val="087F5B"/>
+          <w:sz w:val="20"/>
+        </w:rPr>
+        <w:t>REFERENCES</w:t>
+      </w:r>
+    </w:p>
+    <w:tbl>
+      <w:tblPr>
+        <w:tblW w:type="auto" w:w="0"/>
+        <w:jc w:val="center"/>
+        <w:tblLayout w:type="fixed"/>
+        <w:tblLook w:firstColumn="1" w:firstRow="1" w:lastColumn="0" w:lastRow="0" w:noHBand="0" w:noVBand="1" w:val="04A0"/>
+      </w:tblPr>
+      <w:tblGrid>
+        <w:gridCol w:w="5285"/>
+        <w:gridCol w:w="5285"/>
+      </w:tblGrid>
+      <w:tr>
+        <w:tc>
+          <w:tcPr>
+            <w:tcW w:type="dxa" w:w="5285"/>
+          </w:tcPr>
+          <w:p>
+            <w:pPr>
+              <w:spacing w:before="20" w:after="20"/>
+            </w:pPr>
+            <w:r>
+              <w:rPr>
+                <w:rFonts w:ascii="Aptos" w:hAnsi="Aptos"/>
+                <w:b/>
+                <w:color w:val="17211F"/>
+                <w:sz w:val="19"/>
+              </w:rPr>
+              <w:t>Niel Mesias</w:t>
+            </w:r>
+          </w:p>
+          <w:p>
+            <w:pPr>
+              <w:spacing w:before="0" w:after="20"/>
+            </w:pPr>
+            <w:r>
+              <w:rPr>
+                <w:rFonts w:ascii="Aptos" w:hAnsi="Aptos"/>
+                <w:color w:val="52605C"/>
+                <w:sz w:val="18"/>
+              </w:rPr>
+              <w:t>Software Engineer @ New Era University (No. 9, Central Avenue, New Era, Quezon City, Philippines, 1107)</w:t>
+            </w:r>
+          </w:p>
+          <w:p>
+            <w:pPr>
+              <w:spacing w:before="0" w:after="20"/>
+            </w:pPr>
+            <w:r>
+              <w:rPr>
+                <w:rFonts w:ascii="Aptos" w:hAnsi="Aptos"/>
+                <w:b/>
+                <w:color w:val="17211F"/>
+                <w:sz w:val="17"/>
+              </w:rPr>
+              <w:t xml:space="preserve">Relationship: </w:t>
+            </w:r>
+            <w:r>
+              <w:rPr>
+                <w:rFonts w:ascii="Aptos" w:hAnsi="Aptos"/>
+                <w:color w:val="52605C"/>
+                <w:sz w:val="17"/>
+              </w:rPr>
+              <w:t>Friend / Office Mate</w:t>
+            </w:r>
+          </w:p>
+          <w:p>
+            <w:pPr>
+              <w:spacing w:before="0" w:after="20"/>
+            </w:pPr>
+            <w:r>
+              <w:rPr>
+                <w:rFonts w:ascii="Aptos" w:hAnsi="Aptos"/>
+                <w:b/>
+                <w:color w:val="17211F"/>
+                <w:sz w:val="17"/>
+              </w:rPr>
+              <w:t xml:space="preserve">Cellphone No.: </w:t>
+            </w:r>
+            <w:r>
+              <w:rPr>
+                <w:rFonts w:ascii="Aptos" w:hAnsi="Aptos"/>
+                <w:color w:val="52605C"/>
+                <w:sz w:val="17"/>
+              </w:rPr>
+              <w:t>0906-598-1914</w:t>
+            </w:r>
+          </w:p>
+        </w:tc>
+        <w:tc>
+          <w:tcPr>
+            <w:tcW w:type="dxa" w:w="5285"/>
+          </w:tcPr>
+          <w:p>
+            <w:pPr>
+              <w:spacing w:before="20" w:after="20"/>
+            </w:pPr>
+            <w:r>
+              <w:rPr>
+                <w:rFonts w:ascii="Aptos" w:hAnsi="Aptos"/>
+                <w:b/>
+                <w:color w:val="17211F"/>
+                <w:sz w:val="19"/>
+              </w:rPr>
+              <w:t>Teodorico Ramos</w:t>
+            </w:r>
+          </w:p>
+          <w:p>
+            <w:pPr>
+              <w:spacing w:before="0" w:after="20"/>
+            </w:pPr>
+            <w:r>
+              <w:rPr>
+                <w:rFonts w:ascii="Aptos" w:hAnsi="Aptos"/>
+                <w:b/>
+                <w:color w:val="2359A8"/>
+                <w:sz w:val="18"/>
+              </w:rPr>
+              <w:t>Software Engineer</w:t>
+            </w:r>
+          </w:p>
+          <w:p>
+            <w:pPr>
+              <w:spacing w:before="0" w:after="20"/>
+            </w:pPr>
+            <w:r>
+              <w:rPr>
+                <w:rFonts w:ascii="Aptos" w:hAnsi="Aptos"/>
+                <w:b/>
+                <w:color w:val="17211F"/>
+                <w:sz w:val="17"/>
+              </w:rPr>
+              <w:t xml:space="preserve">Relationship: </w:t>
+            </w:r>
+            <w:r>
+              <w:rPr>
+                <w:rFonts w:ascii="Aptos" w:hAnsi="Aptos"/>
+                <w:color w:val="52605C"/>
+                <w:sz w:val="17"/>
+              </w:rPr>
+              <w:t>Friend</w:t>
+            </w:r>
+          </w:p>
+          <w:p>
+            <w:pPr>
+              <w:spacing w:before="0" w:after="20"/>
+            </w:pPr>
+            <w:r>
+              <w:rPr>
+                <w:rFonts w:ascii="Aptos" w:hAnsi="Aptos"/>
+                <w:b/>
+                <w:color w:val="17211F"/>
+                <w:sz w:val="17"/>
+              </w:rPr>
+              <w:t xml:space="preserve">Cellphone No.: </w:t>
+            </w:r>
+            <w:r>
+              <w:rPr>
+                <w:rFonts w:ascii="Aptos" w:hAnsi="Aptos"/>
+                <w:color w:val="52605C"/>
+                <w:sz w:val="17"/>
+              </w:rPr>
+              <w:t>0967-294-1306</w:t>
+            </w:r>
+          </w:p>
+        </w:tc>
+      </w:tr>
+    </w:tbl>
     <w:sectPr>
       <w:footerReference w:type="default" r:id="rId9"/>
       <w:pgSz w:w="12240" w:h="15840"/>

</xml_diff>

<commit_message>
Simplify company descriptions for interviewers; optimize print resume to 4 seamless continuous pages (hide Experience banner and Capabilities in print)
</commit_message>
<xml_diff>
--- a/PAREJA FELIX M - Updated 2026.docx
+++ b/PAREJA FELIX M - Updated 2026.docx
@@ -387,7 +387,10 @@
         <w:spacing w:before="0" w:after="40"/>
       </w:pPr>
       <w:r>
-        <w:t>Designed, developed, deployed, and maintained 14 major internal platforms spanning dashboards, inventory, personnel, documents, correspondence, directory sync, hymns and media, visitors, access control, integrations, kiosks, and mobile applications. spanning dashboards, inventory, personnel, documents, visitors, reservations, access control, integrations, kiosks, hymns and media, and mobile applications.</w:t>
+        <w:rPr>
+          <w:rFonts w:ascii="Aptos" w:hAnsi="Aptos"/>
+        </w:rPr>
+        <w:t>Architected, developed, and maintained 14 internal enterprise web platforms spanning administrative dashboards, HR/personnel, equipment inventory, documents, correspondence, directory sync, and ITSM using PHP, Laravel, React, Node.js, and MySQL/PostgreSQL.</w:t>
       </w:r>
     </w:p>
     <w:p>
@@ -398,9 +401,8 @@
       <w:r>
         <w:rPr>
           <w:rFonts w:ascii="Aptos" w:hAnsi="Aptos"/>
-          <w:sz w:val="18"/>
         </w:rPr>
-        <w:t>Built full-stack applications using PHP, Laravel, JavaScript, React, MySQL/MariaDB, PostgreSQL, REST APIs, AJAX, authentication, and role-based access control.</w:t>
+        <w:t>Streamlined development and multi-environment deployment using Docker containerization, GitHub, Vercel, Firebase, and self-hosted Proxmox VE Linux servers (Apache/Nginx).</w:t>
       </w:r>
     </w:p>
     <w:p>
@@ -411,9 +413,8 @@
       <w:r>
         <w:rPr>
           <w:rFonts w:ascii="Aptos" w:hAnsi="Aptos"/>
-          <w:sz w:val="18"/>
         </w:rPr>
-        <w:t>Leveraged Docker for application containerization, GitHub for version control, and deployed modern cloud and serverless components using Vercel and Firebase.</w:t>
+        <w:t>Integrated modern AI tools (Claude, OpenAI Codex, AI coding assistants) from 2024 to present to accelerate system architecture, code refactoring, test coverage, and debugging.</w:t>
       </w:r>
     </w:p>
     <w:p>
@@ -424,9 +425,8 @@
       <w:r>
         <w:rPr>
           <w:rFonts w:ascii="Aptos" w:hAnsi="Aptos"/>
-          <w:sz w:val="18"/>
         </w:rPr>
-        <w:t>Actively integrated AI tools from 2024 to present, practicing the proper and responsible use of AI tools (including Claude, OpenAI Codex, and modern AI coding assistants) to accelerate architectural design, code generation, refactoring, test coverage, and complex debugging.</w:t>
+        <w:t>Delivered specialized solutions including interactive Unity3D/C# event kiosks, mobile companion apps, and QR/barcode scanning workflows.</w:t>
       </w:r>
     </w:p>
     <w:p>
@@ -437,9 +437,8 @@
       <w:r>
         <w:rPr>
           <w:rFonts w:ascii="Aptos" w:hAnsi="Aptos"/>
-          <w:sz w:val="18"/>
         </w:rPr>
-        <w:t>Delivered specialized solutions using Unity/C#, mobile applications, QR/barcode workflows, Nextcloud APIs, Chart.js, and network-shared storage.</w:t>
+        <w:t>Owned end-to-end SDLC from requirements gathering and database design through Linux deployment, troubleshooting, and production maintenance.</w:t>
       </w:r>
     </w:p>
     <w:p>
@@ -450,9 +449,8 @@
       <w:r>
         <w:rPr>
           <w:rFonts w:ascii="Aptos" w:hAnsi="Aptos"/>
-          <w:sz w:val="18"/>
         </w:rPr>
-        <w:t>Owned the complete lifecycle from requirements and database design through Linux deployment, Apache/Nginx configuration, Proxmox environments, troubleshooting, and production maintenance.</w:t>
+        <w:t>Alongside engineering, I serve as a part-time programming teacher at SFM School, mentoring students from fundamental programming logic and data requirements gathering through active development, testing, deployment, and practical implementation.</w:t>
       </w:r>
     </w:p>
     <w:p>
@@ -523,9 +521,9 @@
       </w:pPr>
       <w:r>
         <w:rPr>
-          <w:sz w:val="18"/>
+          <w:rFonts w:ascii="Aptos" w:hAnsi="Aptos"/>
         </w:rPr>
-        <w:t>A Makati-based software development company delivering web applications and business software solutions.</w:t>
+        <w:t>Developed and maintained client web applications and business solutions using C# and .NET.</w:t>
       </w:r>
     </w:p>
     <w:p>
@@ -537,9 +535,9 @@
       </w:pPr>
       <w:r>
         <w:rPr>
-          <w:sz w:val="18"/>
+          <w:rFonts w:ascii="Aptos" w:hAnsi="Aptos"/>
         </w:rPr>
-        <w:t>Developed and maintained websites using C#.</w:t>
+        <w:t>Collaborated with engineering teams to implement features, perform code reviews, and resolve software issues.</w:t>
       </w:r>
     </w:p>
     <w:p>
@@ -596,9 +594,9 @@
       </w:pPr>
       <w:r>
         <w:rPr>
-          <w:sz w:val="18"/>
+          <w:rFonts w:ascii="Aptos" w:hAnsi="Aptos"/>
         </w:rPr>
-        <w:t>Developed an internal management website covering attendance, leave, overtime, schedules, payroll, employee records, tasks, requisitions, and payments.</w:t>
+        <w:t>Developed and maintained internal enterprise applications for HR, attendance, payroll, scheduling, and employee records using ASP.NET and SQL Server.</w:t>
       </w:r>
     </w:p>
     <w:p>
@@ -610,9 +608,9 @@
       </w:pPr>
       <w:r>
         <w:rPr>
-          <w:sz w:val="18"/>
+          <w:rFonts w:ascii="Aptos" w:hAnsi="Aptos"/>
         </w:rPr>
-        <w:t>Built an inventory website for asset creation, system-generated tags, stock movement, pullouts, and transaction-history tracking.</w:t>
+        <w:t>Built an equipment inventory and asset-tracking platform featuring system-generated barcode tags, stock movements, and audit history.</w:t>
       </w:r>
     </w:p>
     <w:p>
@@ -624,9 +622,9 @@
       </w:pPr>
       <w:r>
         <w:rPr>
-          <w:sz w:val="18"/>
+          <w:rFonts w:ascii="Aptos" w:hAnsi="Aptos"/>
         </w:rPr>
-        <w:t>Worked across ASP.NET interfaces, SQL Server data, documentation, requirements clarification, and end-user support.</w:t>
+        <w:t>Managed SQL Server databases, wrote stored procedures, clarified requirements with stakeholders, and provided technical support.</w:t>
       </w:r>
     </w:p>
     <w:p>
@@ -683,9 +681,9 @@
       </w:pPr>
       <w:r>
         <w:rPr>
-          <w:sz w:val="18"/>
+          <w:rFonts w:ascii="Aptos" w:hAnsi="Aptos"/>
         </w:rPr>
-        <w:t>Maintained and developed 22 documented internal desktop and web systems for outsourcing projects and company operations.</w:t>
+        <w:t>Developed and maintained 22 desktop and web applications supporting operations and client outsourcing projects using VB.NET, C#, and ASP.NET.</w:t>
       </w:r>
     </w:p>
     <w:p>
@@ -697,9 +695,9 @@
       </w:pPr>
       <w:r>
         <w:rPr>
-          <w:sz w:val="18"/>
+          <w:rFonts w:ascii="Aptos" w:hAnsi="Aptos"/>
         </w:rPr>
-        <w:t>Designed SQL Server databases, tables, stored procedures, queries, and functions for work-management and reporting applications.</w:t>
+        <w:t>Designed and optimized SQL Server databases, stored procedures, and reporting queries for operational data processing.</w:t>
       </w:r>
     </w:p>
     <w:p>
@@ -711,9 +709,9 @@
       </w:pPr>
       <w:r>
         <w:rPr>
-          <w:sz w:val="18"/>
+          <w:rFonts w:ascii="Aptos" w:hAnsi="Aptos"/>
         </w:rPr>
-        <w:t>Produced technical documentation, trained users, verified system performance, and coordinated requirements with clients and senior developers.</w:t>
+        <w:t>Authored technical documentation, coordinated requirements with senior developers, and conducted user training.</w:t>
       </w:r>
     </w:p>
     <w:p>

</xml_diff>